<commit_message>
AHG: agent-writing tutorial; survey asks name, email and GitHub username
kit/write-your-own-agent.md is a start-to-finish tutorial for writing an
agent on your own in any assistant: one job, the header, the six sections,
the Never rules, trying it with no evidence, grounding it, revising one
change at a time, installing and sharing it, with a running example on the
sample course's captions, common mistakes and their fixes, exercises with
model answers, a checklist and the template. Built in four formats; linked
from the kit README, step card 7 and the Accessibility Agents page.

The survey now asks name and email (needed) and GitHub username (optional,
checked against GitHub's rules, with sign-up links) first, and the results
page lists who answered. Step card 0 and the pocket card point to it.

Checks: formats 20 of 20 (80 files); audit 77 of 77; AHG tests 123 passed;
survey axe-core 0 violations.

Co-Authored-By: Claude Opus 5.5 <noreply@anthropic.com>
</commit_message>
<xml_diff>
--- a/docs/ahg-2026/kit/accessibility-agents.docx
+++ b/docs/ahg-2026/kit/accessibility-agents.docx
@@ -1080,7 +1080,15 @@
       </w:r>
       <w:r>
         <w:rPr/>
-        <w:t xml:space="preserve"> in this kit.</w:t>
+        <w:t xml:space="preserve"> in this kit, and </w:t>
+      </w:r>
+      <w:r>
+        <w:rPr/>
+        <w:t>write-your-own-agent.md</w:t>
+      </w:r>
+      <w:r>
+        <w:rPr/>
+        <w:t xml:space="preserve"> walks through writing a new one from a blank file.</w:t>
       </w:r>
     </w:p>
     <w:p>

</xml_diff>